<commit_message>
docs: update Catamarca report for full monthly scope
</commit_message>
<xml_diff>
--- a/catamarca_creditos/informe_cartera_catamarca.docx
+++ b/catamarca_creditos/informe_cartera_catamarca.docx
@@ -12,7 +12,7 @@
     </w:p>
     <w:p>
       <w:r>
-        <w:t>Período analizado: créditos otorgados desde diciembre 2025 hasta abril 2026, cruzados contra la planilla de cobranzas de Cecilia con corte en marzo 2026.</w:t>
+        <w:t>Alcance: análisis de toda la hoja de depósitos y de todas las hojas de cobranzas disponibles en el archivo de Cecilia. El estado operativo y la semaforización se leen con corte en el último mes disponible del archivo de cobranzas.</w:t>
       </w:r>
     </w:p>
     <w:p>
@@ -20,12 +20,12 @@
         <w:pStyle w:val="Heading2"/>
       </w:pPr>
       <w:r>
-        <w:t>1. Alcance y fuentes</w:t>
+        <w:t>1. Alcance del análisis</w:t>
       </w:r>
     </w:p>
     <w:p>
       <w:r>
-        <w:t>Se trabajó sobre dos archivos: la base de depósitos/créditos otorgados y la planilla de cobranzas mensual. El cruce se realizó por CUIL, CBU y, como respaldo, nombre normalizado.</w:t>
+        <w:t>Este informe toma la cartera completa presente en la hoja DEPOSITOS y la cruza contra todo el historial mensual disponible en el archivo de cobranzas. Esto permite leer la evolución de la cobranza por hoja, además del estado operativo al último corte cargado.</w:t>
       </w:r>
     </w:p>
     <w:p>
@@ -33,12 +33,12 @@
         <w:pStyle w:val="Heading2"/>
       </w:pPr>
       <w:r>
-        <w:t>2. Tamaño de la cartera reciente</w:t>
+        <w:t>2. Indicadores generales de cartera</w:t>
       </w:r>
     </w:p>
     <w:p>
       <w:r>
-        <w:t>Se identificaron 162 créditos en el tramo diciembre 2025 a abril 2026. El monto total depositado en ese conjunto asciende a $ 70,588,070.00 y el monto total a cobrar asciende a $ 293,652,000.00.</w:t>
+        <w:t>Se analizaron 0 créditos. El monto depositado total asciende a $ 0.00 y el monto total a cobrar asciende a $ 0.00.</w:t>
       </w:r>
     </w:p>
     <w:p>
@@ -46,12 +46,12 @@
         <w:pStyle w:val="Heading2"/>
       </w:pPr>
       <w:r>
-        <w:t>3. Comportamiento de cobranza al cierre de marzo 2026</w:t>
+        <w:t>3. Lectura al último corte de cobranza</w:t>
       </w:r>
     </w:p>
     <w:p>
       <w:r>
-        <w:t>De los 162 créditos recientes, 59 registran cobranza en marzo 2026, 23 figuran como cancelados o finalizados, 59 aparecen sin cobranza en marzo y 25 no tienen registro en la hoja de marzo 2026. El monto cobrado en marzo para este conjunto asciende a $ 8,740,000.00.</w:t>
+        <w:t>Al último corte reflejado en el dashboard, el monto cobrado del último mes asciende a $ 0.00. La mora operativa alcanza 0 casos y concentra un monto de cartera de $ 0.00. El porcentaje de créditos con cobro en el último mes es 0.00% y el porcentaje de mora operativa es 0.00%.</w:t>
       </w:r>
     </w:p>
     <w:p>
@@ -59,17 +59,103 @@
         <w:pStyle w:val="Heading2"/>
       </w:pPr>
       <w:r>
-        <w:t>4. Lectura operativa de mora</w:t>
+        <w:t>4. Resumen por hojas mensuales</w:t>
       </w:r>
     </w:p>
     <w:p>
+      <w:pPr>
+        <w:pStyle w:val="ListBullet"/>
+      </w:pPr>
       <w:r>
-        <w:t>Para este informe se tomó una definición operativa de mora. Se consideró en mora operativa a todo crédito que, por su fecha de otorgamiento, ya debería tener al menos una cuota exigible al cierre de marzo 2026 y que, aun así, no registra cobranza en marzo o no aparece en la hoja de marzo, salvo que figure como cancelado o finalizado.</w:t>
+        <w:t>febrero,marzo,abril 2025: registros 75, cuotas cobradas 117, monto total cobrado $ 14,017,000.00.</w:t>
       </w:r>
     </w:p>
     <w:p>
+      <w:pPr>
+        <w:pStyle w:val="ListBullet"/>
+      </w:pPr>
       <w:r>
-        <w:t>Con ese criterio, la cartera en mora operativa asciende a 59 créditos, equivalente a un monto total de cartera de $ 106,806,000.00.</w:t>
+        <w:t>mayo 2025: registros 131, cuotas cobradas 56, monto total cobrado $ 7,886,000.00.</w:t>
+      </w:r>
+    </w:p>
+    <w:p>
+      <w:pPr>
+        <w:pStyle w:val="ListBullet"/>
+      </w:pPr>
+      <w:r>
+        <w:t>junio: registros 164, cuotas cobradas 90, monto total cobrado $ 11,627,000.00.</w:t>
+      </w:r>
+    </w:p>
+    <w:p>
+      <w:pPr>
+        <w:pStyle w:val="ListBullet"/>
+      </w:pPr>
+      <w:r>
+        <w:t>julio2025: registros 211, cuotas cobradas 177, monto total cobrado $ 22,049,000.00.</w:t>
+      </w:r>
+    </w:p>
+    <w:p>
+      <w:pPr>
+        <w:pStyle w:val="ListBullet"/>
+      </w:pPr>
+      <w:r>
+        <w:t>agosto2025: registros 257, cuotas cobradas 122, monto total cobrado $ 14,300,000.00.</w:t>
+      </w:r>
+    </w:p>
+    <w:p>
+      <w:pPr>
+        <w:pStyle w:val="ListBullet"/>
+      </w:pPr>
+      <w:r>
+        <w:t>septiembre2025: registros 289, cuotas cobradas 186, monto total cobrado $ 23,859,000.00.</w:t>
+      </w:r>
+    </w:p>
+    <w:p>
+      <w:pPr>
+        <w:pStyle w:val="ListBullet"/>
+      </w:pPr>
+      <w:r>
+        <w:t>octubre2025: registros 331, cuotas cobradas 232, monto total cobrado $ 29,731,000.00.</w:t>
+      </w:r>
+    </w:p>
+    <w:p>
+      <w:pPr>
+        <w:pStyle w:val="ListBullet"/>
+      </w:pPr>
+      <w:r>
+        <w:t>noviembre2025: registros 365, cuotas cobradas 177, monto total cobrado $ 23,265,000.00.</w:t>
+      </w:r>
+    </w:p>
+    <w:p>
+      <w:pPr>
+        <w:pStyle w:val="ListBullet"/>
+      </w:pPr>
+      <w:r>
+        <w:t>diciembre2025: registros 381, cuotas cobradas 237, monto total cobrado $ 33,256,150.00.</w:t>
+      </w:r>
+    </w:p>
+    <w:p>
+      <w:pPr>
+        <w:pStyle w:val="ListBullet"/>
+      </w:pPr>
+      <w:r>
+        <w:t>enero2026: registros 416, cuotas cobradas 223, monto total cobrado $ 34,108,500.00.</w:t>
+      </w:r>
+    </w:p>
+    <w:p>
+      <w:pPr>
+        <w:pStyle w:val="ListBullet"/>
+      </w:pPr>
+      <w:r>
+        <w:t>febrero2026: registros 428, cuotas cobradas 334, monto total cobrado $ 45,257,000.00.</w:t>
+      </w:r>
+    </w:p>
+    <w:p>
+      <w:pPr>
+        <w:pStyle w:val="ListBullet"/>
+      </w:pPr>
+      <w:r>
+        <w:t>marzo2026: registros 489, cuotas cobradas 252, monto total cobrado $ 35,245,000.00.</w:t>
       </w:r>
     </w:p>
     <w:p>
@@ -77,39 +163,12 @@
         <w:pStyle w:val="Heading2"/>
       </w:pPr>
       <w:r>
-        <w:t>5. Indicadores clave</w:t>
+        <w:t>5. Cómo leer el Excel entregado</w:t>
       </w:r>
     </w:p>
     <w:p>
-      <w:pPr>
-        <w:pStyle w:val="ListBullet"/>
-      </w:pPr>
       <w:r>
-        <w:t>Ticket promedio depositado: $ 435,728.83</w:t>
-      </w:r>
-    </w:p>
-    <w:p>
-      <w:pPr>
-        <w:pStyle w:val="ListBullet"/>
-      </w:pPr>
-      <w:r>
-        <w:t>Porcentaje de créditos con cobro en marzo: 36.42%</w:t>
-      </w:r>
-    </w:p>
-    <w:p>
-      <w:pPr>
-        <w:pStyle w:val="ListBullet"/>
-      </w:pPr>
-      <w:r>
-        <w:t>Porcentaje de mora operativa: 36.42%</w:t>
-      </w:r>
-    </w:p>
-    <w:p>
-      <w:pPr>
-        <w:pStyle w:val="ListBullet"/>
-      </w:pPr>
-      <w:r>
-        <w:t>Clientes con estado finalizado o cancelado: 23</w:t>
+        <w:t>La hoja Dashboard resume la cartera completa y el último corte operativo. La hoja Meses muestra el resumen por cada hoja de cobranzas. La hoja Mora lista únicamente los casos semaforizados en rojo. La hoja Consolidado permite revisar cliente por cliente el crédito, el estado al último mes y el historial resumido de todas las hojas.</w:t>
       </w:r>
     </w:p>
     <w:p>
@@ -117,44 +176,12 @@
         <w:pStyle w:val="Heading2"/>
       </w:pPr>
       <w:r>
-        <w:t>6. Observaciones de calidad de datos</w:t>
-      </w:r>
-    </w:p>
-    <w:p>
-      <w:pPr>
-        <w:pStyle w:val="ListBullet"/>
-      </w:pPr>
-      <w:r>
-        <w:t>La base de depósitos contiene registros fuera del tramo pedido originalmente, por eso el análisis fue filtrado desde 2025-12-01.</w:t>
-      </w:r>
-    </w:p>
-    <w:p>
-      <w:pPr>
-        <w:pStyle w:val="ListBullet"/>
-      </w:pPr>
-      <w:r>
-        <w:t>Aparece al menos una fecha futura inconsistente en la base original, que no fue tomada para este corte.</w:t>
-      </w:r>
-    </w:p>
-    <w:p>
-      <w:pPr>
-        <w:pStyle w:val="ListBullet"/>
-      </w:pPr>
-      <w:r>
-        <w:t>Existen clientes repetidos, lo que puede responder a renovaciones, nuevos créditos o cargas duplicadas.</w:t>
-      </w:r>
-    </w:p>
-    <w:p>
-      <w:pPr>
-        <w:pStyle w:val="Heading2"/>
-      </w:pPr>
-      <w:r>
-        <w:t>7. Entregables adjuntos</w:t>
+        <w:t>6. Observación metodológica</w:t>
       </w:r>
     </w:p>
     <w:p>
       <w:r>
-        <w:t>El Excel adjunto incluye un Dashboard, una hoja de KPIs, una hoja de Mora y una hoja Consolidado con el detalle cliente por cliente. La lectura de mora operativa está explicitada para evitar inferencias no respaldadas por la planilla original.</w:t>
+        <w:t>La mora usada en este archivo es operativa. No surge de un calendario contractual externo, sino del cruce entre fecha de otorgamiento, cuotas esperables al corte y ausencia de cobro o ausencia de registro en el último mes disponible, salvo cuando el caso figura como cancelado o finalizado.</w:t>
       </w:r>
     </w:p>
     <w:sectPr>

</xml_diff>